<commit_message>
docs(pi): finalize technical report with authors and review fixes
</commit_message>
<xml_diff>
--- a/PI/docs/Endpoint_Investigator_Relatorio_Tecnico_Final.docx
+++ b/PI/docs/Endpoint_Investigator_Relatorio_Tecnico_Final.docx
@@ -48,6 +48,16 @@
     </w:p>
     <w:p>
       <w:pPr>
+        <w:spacing w:after="120"/>
+        <w:jc w:val="center"/>
+      </w:pPr>
+      <w:r>
+        <w:rPr/>
+        <w:t>Integrantes: Nicholas Nakano Thuesen e Alison Araujo</w:t>
+      </w:r>
+    </w:p>
+    <w:p>
+      <w:pPr>
         <w:spacing w:before="80" w:after="60"/>
       </w:pPr>
       <w:r>
@@ -72,6 +82,83 @@
           <w:sz w:val="19"/>
         </w:rPr>
         <w:t>O Endpoint Investigator é uma ferramenta local, read-only e executada sob demanda para apoiar a investigação de segurança de endpoints GNU/Linux. O projeto parte do princípio de que sinais isolados — como um processo com nome incomum, um serviço executado como root ou uma porta em escuta — não caracterizam, por si só, um incidente. A ferramenta coleta fatos, relaciona entidades e produz hipóteses rastreáveis, deixando explícito o que ainda não pode ser concluído.</w:t>
+      </w:r>
+    </w:p>
+    <w:p>
+      <w:pPr>
+        <w:spacing w:after="100" w:line="252" w:lineRule="auto"/>
+      </w:pPr>
+      <w:r>
+        <w:rPr>
+          <w:rFonts w:ascii="Aptos" w:hAnsi="Aptos"/>
+          <w:b/>
+          <w:i w:val="0"/>
+          <w:sz w:val="19"/>
+        </w:rPr>
+        <w:t xml:space="preserve">Classes de resultado. </w:t>
+      </w:r>
+      <w:r>
+        <w:rPr>
+          <w:rFonts w:ascii="Aptos" w:hAnsi="Aptos"/>
+          <w:b w:val="0"/>
+          <w:i w:val="0"/>
+          <w:sz w:val="19"/>
+        </w:rPr>
+        <w:t xml:space="preserve">Cada finding recebe uma de três classes: </w:t>
+      </w:r>
+      <w:r>
+        <w:rPr>
+          <w:rFonts w:ascii="Aptos" w:hAnsi="Aptos"/>
+          <w:b/>
+          <w:i w:val="0"/>
+          <w:sz w:val="19"/>
+        </w:rPr>
+        <w:t xml:space="preserve">needs_review</w:t>
+      </w:r>
+      <w:r>
+        <w:rPr>
+          <w:rFonts w:ascii="Aptos" w:hAnsi="Aptos"/>
+          <w:b w:val="0"/>
+          <w:i w:val="0"/>
+          <w:sz w:val="19"/>
+        </w:rPr>
+        <w:t xml:space="preserve"> (combinação de sinais que justifica investigação humana), </w:t>
+      </w:r>
+      <w:r>
+        <w:rPr>
+          <w:rFonts w:ascii="Aptos" w:hAnsi="Aptos"/>
+          <w:b/>
+          <w:i w:val="0"/>
+          <w:sz w:val="19"/>
+        </w:rPr>
+        <w:t xml:space="preserve">informational</w:t>
+      </w:r>
+      <w:r>
+        <w:rPr>
+          <w:rFonts w:ascii="Aptos" w:hAnsi="Aptos"/>
+          <w:b w:val="0"/>
+          <w:i w:val="0"/>
+          <w:sz w:val="19"/>
+        </w:rPr>
+        <w:t xml:space="preserve"> (relação observada e registrada como contexto, sem indicar problema) e </w:t>
+      </w:r>
+      <w:r>
+        <w:rPr>
+          <w:rFonts w:ascii="Aptos" w:hAnsi="Aptos"/>
+          <w:b/>
+          <w:i w:val="0"/>
+          <w:sz w:val="19"/>
+        </w:rPr>
+        <w:t xml:space="preserve">inconclusive</w:t>
+      </w:r>
+      <w:r>
+        <w:rPr>
+          <w:rFonts w:ascii="Aptos" w:hAnsi="Aptos"/>
+          <w:b w:val="0"/>
+          <w:i w:val="0"/>
+          <w:sz w:val="19"/>
+        </w:rPr>
+        <w:t xml:space="preserve"> (dados insuficientes; as lacunas são listadas). Não existe classe “vulnerável” ou “malicioso”: a ferramenta nunca conclui exploração ou comprometimento.</w:t>
       </w:r>
     </w:p>
     <w:tbl>
@@ -90,8 +177,8 @@
         </w:tblBorders>
       </w:tblPr>
       <w:tblGrid>
-        <w:gridCol w:w="5074"/>
-        <w:gridCol w:w="5074"/>
+        <w:gridCol w:w="4932"/>
+        <w:gridCol w:w="4932"/>
       </w:tblGrid>
       <w:tr>
         <w:tc>
@@ -103,7 +190,7 @@
               <w:bottom w:w="95" w:type="dxa"/>
               <w:end w:w="120" w:type="dxa"/>
             </w:tcMar>
-            <w:shd w:fill="F4F7FB"/>
+            <w:shd w:val="clear" w:color="auto" w:fill="F4F7FB"/>
           </w:tcPr>
           <w:p>
             <w:r>
@@ -175,7 +262,7 @@
               <w:bottom w:w="95" w:type="dxa"/>
               <w:end w:w="120" w:type="dxa"/>
             </w:tcMar>
-            <w:shd w:fill="F4F7FB"/>
+            <w:shd w:val="clear" w:color="auto" w:fill="F4F7FB"/>
           </w:tcPr>
           <w:p>
             <w:r>
@@ -270,12 +357,12 @@
         </w:tblBorders>
       </w:tblPr>
       <w:tblGrid>
-        <w:gridCol w:w="1691"/>
-        <w:gridCol w:w="1691"/>
-        <w:gridCol w:w="1691"/>
-        <w:gridCol w:w="1691"/>
-        <w:gridCol w:w="1691"/>
-        <w:gridCol w:w="1691"/>
+        <w:gridCol w:w="1485"/>
+        <w:gridCol w:w="1485"/>
+        <w:gridCol w:w="1485"/>
+        <w:gridCol w:w="1485"/>
+        <w:gridCol w:w="1485"/>
+        <w:gridCol w:w="1729"/>
       </w:tblGrid>
       <w:tr>
         <w:tc>
@@ -288,7 +375,7 @@
               <w:end w:w="55" w:type="dxa"/>
             </w:tcMar>
             <w:vAlign w:val="center"/>
-            <w:shd w:fill="EAF1F8"/>
+            <w:shd w:val="clear" w:color="auto" w:fill="EAF1F8"/>
           </w:tcPr>
           <w:p>
             <w:pPr>
@@ -316,7 +403,7 @@
               <w:end w:w="55" w:type="dxa"/>
             </w:tcMar>
             <w:vAlign w:val="center"/>
-            <w:shd w:fill="F5F8FC"/>
+            <w:shd w:val="clear" w:color="auto" w:fill="F5F8FC"/>
           </w:tcPr>
           <w:p>
             <w:pPr>
@@ -344,7 +431,7 @@
               <w:end w:w="55" w:type="dxa"/>
             </w:tcMar>
             <w:vAlign w:val="center"/>
-            <w:shd w:fill="EAF1F8"/>
+            <w:shd w:val="clear" w:color="auto" w:fill="EAF1F8"/>
           </w:tcPr>
           <w:p>
             <w:pPr>
@@ -372,7 +459,7 @@
               <w:end w:w="55" w:type="dxa"/>
             </w:tcMar>
             <w:vAlign w:val="center"/>
-            <w:shd w:fill="F5F8FC"/>
+            <w:shd w:val="clear" w:color="auto" w:fill="F5F8FC"/>
           </w:tcPr>
           <w:p>
             <w:pPr>
@@ -400,7 +487,7 @@
               <w:end w:w="55" w:type="dxa"/>
             </w:tcMar>
             <w:vAlign w:val="center"/>
-            <w:shd w:fill="EAF1F8"/>
+            <w:shd w:val="clear" w:color="auto" w:fill="EAF1F8"/>
           </w:tcPr>
           <w:p>
             <w:pPr>
@@ -428,7 +515,7 @@
               <w:end w:w="55" w:type="dxa"/>
             </w:tcMar>
             <w:vAlign w:val="center"/>
-            <w:shd w:fill="F5F8FC"/>
+            <w:shd w:val="clear" w:color="auto" w:fill="F5F8FC"/>
           </w:tcPr>
           <w:p>
             <w:pPr>
@@ -460,6 +547,29 @@
           <w:sz w:val="18"/>
         </w:rPr>
         <w:t>O mesmo núcleo de correlação é reutilizado em dois caminhos: (a) scan ao vivo na Kali, com coleta do host; e (b) análise offline de snapshots JSON, usada para testes determinísticos e demonstrações reproduzíveis. Coletores observam; modelos normalizam; a correlação relaciona entidades; e a camada de apresentação apenas transforma o resultado em texto ou JSON.</w:t>
+      </w:r>
+    </w:p>
+    <w:p>
+      <w:pPr>
+        <w:spacing w:after="80" w:line="252" w:lineRule="auto"/>
+      </w:pPr>
+      <w:r>
+        <w:rPr>
+          <w:rFonts w:ascii="Aptos" w:hAnsi="Aptos"/>
+          <w:b/>
+          <w:i w:val="0"/>
+          <w:sz w:val="19"/>
+        </w:rPr>
+        <w:t xml:space="preserve">Relação com o fluxo de referência do enunciado: </w:t>
+      </w:r>
+      <w:r>
+        <w:rPr>
+          <w:rFonts w:ascii="Aptos" w:hAnsi="Aptos"/>
+          <w:b w:val="0"/>
+          <w:i w:val="0"/>
+          <w:sz w:val="19"/>
+        </w:rPr>
+        <w:t xml:space="preserve">Coleta → Normalização → Correlação correspondem às etapas homônimas; a etapa Permissões é uma análise contextual executada apenas sobre recursos que a correlação precisa avaliar; Evidências e Hipóteses ficam dentro de cada Finding (seção 3); Texto/JSON é o Resultado da investigação.</w:t>
       </w:r>
     </w:p>
     <w:p>
@@ -492,15 +602,15 @@
         </w:tblBorders>
       </w:tblPr>
       <w:tblGrid>
-        <w:gridCol w:w="3383"/>
-        <w:gridCol w:w="3383"/>
-        <w:gridCol w:w="3383"/>
+        <w:gridCol w:w="2267"/>
+        <w:gridCol w:w="2834"/>
+        <w:gridCol w:w="4875"/>
       </w:tblGrid>
       <w:tr>
         <w:tc>
           <w:tcPr>
             <w:tcW w:type="dxa" w:w="2267"/>
-            <w:shd w:fill="D9E2F3"/>
+            <w:shd w:val="clear" w:color="auto" w:fill="D9E2F3"/>
             <w:tcMar>
               <w:top w:w="55" w:type="dxa"/>
               <w:start w:w="70" w:type="dxa"/>
@@ -524,7 +634,7 @@
         <w:tc>
           <w:tcPr>
             <w:tcW w:type="dxa" w:w="2834"/>
-            <w:shd w:fill="D9E2F3"/>
+            <w:shd w:val="clear" w:color="auto" w:fill="D9E2F3"/>
             <w:tcMar>
               <w:top w:w="55" w:type="dxa"/>
               <w:start w:w="70" w:type="dxa"/>
@@ -548,7 +658,7 @@
         <w:tc>
           <w:tcPr>
             <w:tcW w:type="dxa" w:w="4875"/>
-            <w:shd w:fill="D9E2F3"/>
+            <w:shd w:val="clear" w:color="auto" w:fill="D9E2F3"/>
             <w:tcMar>
               <w:top w:w="55" w:type="dxa"/>
               <w:start w:w="70" w:type="dxa"/>
@@ -844,7 +954,31 @@
       </w:tr>
     </w:tbl>
     <w:p>
-      <w:r>
+      <w:pPr>
+        <w:spacing w:after="0" w:line="252" w:lineRule="auto"/>
+      </w:pPr>
+      <w:r>
+        <w:rPr>
+          <w:rFonts w:ascii="Aptos" w:hAnsi="Aptos"/>
+          <w:b/>
+          <w:i w:val="0"/>
+          <w:sz w:val="19"/>
+        </w:rPr>
+        <w:t xml:space="preserve">Por que rede? </w:t>
+      </w:r>
+      <w:r>
+        <w:rPr>
+          <w:rFonts w:ascii="Aptos" w:hAnsi="Aptos"/>
+          <w:b w:val="0"/>
+          <w:i w:val="0"/>
+          <w:sz w:val="19"/>
+        </w:rPr>
+        <w:t xml:space="preserve">Além das três dimensões obrigatórias, conexões de rede foram incorporadas porque o enunciado cita como exemplo de correlação “um processo que gerencia uma porta de comunicação”. Essa fonte alimenta exclusivamente C2 e não gera findings por si só.</w:t>
+      </w:r>
+    </w:p>
+    <w:p>
+      <w:r>
+        <w:rPr/>
         <w:br w:type="page"/>
       </w:r>
     </w:p>
@@ -892,10 +1026,10 @@
         </w:tblBorders>
       </w:tblPr>
       <w:tblGrid>
-        <w:gridCol w:w="2537"/>
-        <w:gridCol w:w="2537"/>
-        <w:gridCol w:w="2537"/>
-        <w:gridCol w:w="2537"/>
+        <w:gridCol w:w="1247"/>
+        <w:gridCol w:w="3855"/>
+        <w:gridCol w:w="1757"/>
+        <w:gridCol w:w="3118"/>
       </w:tblGrid>
       <w:tr>
         <w:trPr>
@@ -904,7 +1038,7 @@
         <w:tc>
           <w:tcPr>
             <w:tcW w:type="dxa" w:w="1247"/>
-            <w:shd w:fill="D9E2F3"/>
+            <w:shd w:val="clear" w:color="auto" w:fill="D9E2F3"/>
             <w:tcMar>
               <w:top w:w="60" w:type="dxa"/>
               <w:start w:w="65" w:type="dxa"/>
@@ -928,7 +1062,7 @@
         <w:tc>
           <w:tcPr>
             <w:tcW w:type="dxa" w:w="3855"/>
-            <w:shd w:fill="D9E2F3"/>
+            <w:shd w:val="clear" w:color="auto" w:fill="D9E2F3"/>
             <w:tcMar>
               <w:top w:w="60" w:type="dxa"/>
               <w:start w:w="65" w:type="dxa"/>
@@ -952,7 +1086,7 @@
         <w:tc>
           <w:tcPr>
             <w:tcW w:type="dxa" w:w="1757"/>
-            <w:shd w:fill="D9E2F3"/>
+            <w:shd w:val="clear" w:color="auto" w:fill="D9E2F3"/>
             <w:tcMar>
               <w:top w:w="60" w:type="dxa"/>
               <w:start w:w="65" w:type="dxa"/>
@@ -976,7 +1110,7 @@
         <w:tc>
           <w:tcPr>
             <w:tcW w:type="dxa" w:w="3118"/>
-            <w:shd w:fill="D9E2F3"/>
+            <w:shd w:val="clear" w:color="auto" w:fill="D9E2F3"/>
             <w:tcMar>
               <w:top w:w="60" w:type="dxa"/>
               <w:start w:w="65" w:type="dxa"/>
@@ -1295,6 +1429,29 @@
           <w:sz w:val="18"/>
         </w:rPr>
         <w:t>Além da associação direta (socket.pid == service.main_pid), a versão final reconhece processos filhos e netos quando a cadeia PPID observada alcança o MainPID. O finding registra a proveniência como direct_main_pid ou descendant_of_main_pid e, no segundo caso, inclui a cadeia de PIDs usada como evidência. A travessia encerra com segurança em PPID ausente, pai não observado, self-parent ou ciclo. Essa ancestralidade é contexto investigativo, não prova autoritativa de membership systemd.</w:t>
+      </w:r>
+    </w:p>
+    <w:p>
+      <w:pPr>
+        <w:spacing w:after="80" w:line="252" w:lineRule="auto"/>
+      </w:pPr>
+      <w:r>
+        <w:rPr>
+          <w:rFonts w:ascii="Aptos" w:hAnsi="Aptos"/>
+          <w:b/>
+          <w:i w:val="0"/>
+          <w:sz w:val="19"/>
+        </w:rPr>
+        <w:t xml:space="preserve">Relação com as correlações sugeridas no enunciado: </w:t>
+      </w:r>
+      <w:r>
+        <w:rPr>
+          <w:rFonts w:ascii="Aptos" w:hAnsi="Aptos"/>
+          <w:b w:val="0"/>
+          <w:i w:val="0"/>
+          <w:sz w:val="19"/>
+        </w:rPr>
+        <w:t xml:space="preserve">C1 implementa “processo + serviço + permissão” e “serviço + arquivo + usuário”; C3 implementa “processo + PPID + usuário”; C2 é uma correlação própria (socket + processo + serviço). A correlação com logs (“processo + serviço + log”) não foi implementada — ver limitações.</w:t>
       </w:r>
     </w:p>
     <w:p>
@@ -1327,8 +1484,8 @@
         </w:tblBorders>
       </w:tblPr>
       <w:tblGrid>
-        <w:gridCol w:w="5074"/>
-        <w:gridCol w:w="5074"/>
+        <w:gridCol w:w="4988"/>
+        <w:gridCol w:w="4988"/>
       </w:tblGrid>
       <w:tr>
         <w:tc>
@@ -1340,7 +1497,7 @@
               <w:bottom w:w="100" w:type="dxa"/>
               <w:end w:w="115" w:type="dxa"/>
             </w:tcMar>
-            <w:shd w:fill="F4F7FB"/>
+            <w:shd w:val="clear" w:color="auto" w:fill="F4F7FB"/>
           </w:tcPr>
           <w:p>
             <w:r>
@@ -1378,7 +1535,7 @@
               <w:bottom w:w="100" w:type="dxa"/>
               <w:end w:w="115" w:type="dxa"/>
             </w:tcMar>
-            <w:shd w:fill="F4F7FB"/>
+            <w:shd w:val="clear" w:color="auto" w:fill="F4F7FB"/>
           </w:tcPr>
           <w:p>
             <w:r>
@@ -1418,7 +1575,7 @@
               <w:bottom w:w="100" w:type="dxa"/>
               <w:end w:w="115" w:type="dxa"/>
             </w:tcMar>
-            <w:shd w:fill="F4F7FB"/>
+            <w:shd w:val="clear" w:color="auto" w:fill="F4F7FB"/>
           </w:tcPr>
           <w:p>
             <w:r>
@@ -1456,7 +1613,7 @@
               <w:bottom w:w="100" w:type="dxa"/>
               <w:end w:w="115" w:type="dxa"/>
             </w:tcMar>
-            <w:shd w:fill="F4F7FB"/>
+            <w:shd w:val="clear" w:color="auto" w:fill="F4F7FB"/>
           </w:tcPr>
           <w:p>
             <w:r>
@@ -1558,7 +1715,41 @@
       </w:r>
     </w:p>
     <w:p>
-      <w:r>
+      <w:pPr>
+        <w:pStyle w:val="ListBullet"/>
+        <w:spacing w:after="36" w:line="240" w:lineRule="auto"/>
+        <w:ind w:left="198" w:hanging="85"/>
+      </w:pPr>
+      <w:r>
+        <w:rPr/>
+        <w:t>Scripts absolutos em ExecStart simples são analisados junto ao interpretador; formas ambíguas geram issue.</w:t>
+      </w:r>
+    </w:p>
+    <w:p>
+      <w:pPr>
+        <w:pStyle w:val="ListBullet"/>
+        <w:spacing w:after="36" w:line="240" w:lineRule="auto"/>
+        <w:ind w:left="198" w:hanging="85"/>
+      </w:pPr>
+      <w:r>
+        <w:rPr/>
+        <w:t>C1 considera escrita direta e substituição pelo diretório pai imediato; group-writable isolado permanece inconclusivo.</w:t>
+      </w:r>
+    </w:p>
+    <w:p>
+      <w:pPr>
+        <w:pStyle w:val="ListBullet"/>
+        <w:spacing w:after="36" w:line="240" w:lineRule="auto"/>
+        <w:ind w:left="198" w:hanging="85"/>
+      </w:pPr>
+      <w:r>
+        <w:rPr/>
+        <w:t>C3 considera relevantes MainPIDs de serviços observados e processos associados a listeners, evitando gerar contexto para toda a árvore.</w:t>
+      </w:r>
+    </w:p>
+    <w:p>
+      <w:r>
+        <w:rPr/>
         <w:br w:type="page"/>
       </w:r>
     </w:p>
@@ -1606,9 +1797,9 @@
         </w:tblBorders>
       </w:tblPr>
       <w:tblGrid>
-        <w:gridCol w:w="3383"/>
-        <w:gridCol w:w="3383"/>
-        <w:gridCol w:w="3383"/>
+        <w:gridCol w:w="3231"/>
+        <w:gridCol w:w="3231"/>
+        <w:gridCol w:w="3231"/>
       </w:tblGrid>
       <w:tr>
         <w:tc>
@@ -1620,7 +1811,7 @@
               <w:bottom w:w="90" w:type="dxa"/>
               <w:end w:w="70" w:type="dxa"/>
             </w:tcMar>
-            <w:shd w:fill="EAF1F8"/>
+            <w:shd w:val="clear" w:color="auto" w:fill="EAF1F8"/>
           </w:tcPr>
           <w:p>
             <w:pPr>
@@ -1663,7 +1854,7 @@
               <w:bottom w:w="90" w:type="dxa"/>
               <w:end w:w="70" w:type="dxa"/>
             </w:tcMar>
-            <w:shd w:fill="EAF1F8"/>
+            <w:shd w:val="clear" w:color="auto" w:fill="EAF1F8"/>
           </w:tcPr>
           <w:p>
             <w:pPr>
@@ -1706,7 +1897,7 @@
               <w:bottom w:w="90" w:type="dxa"/>
               <w:end w:w="70" w:type="dxa"/>
             </w:tcMar>
-            <w:shd w:fill="EAF1F8"/>
+            <w:shd w:val="clear" w:color="auto" w:fill="EAF1F8"/>
           </w:tcPr>
           <w:p>
             <w:pPr>
@@ -1720,7 +1911,7 @@
                 <w:color w:val="17365D"/>
                 <w:sz w:val="26"/>
               </w:rPr>
-              <w:t>main limpa</w:t>
+              <w:t>4 cenários</w:t>
             </w:r>
           </w:p>
           <w:p>
@@ -1736,7 +1927,7 @@
                 <w:color w:val="595959"/>
                 <w:sz w:val="16"/>
               </w:rPr>
-              <w:t>clone sincronizado com origin/main</w:t>
+              <w:t>normal, unsafe_service, listener, partial</w:t>
             </w:r>
           </w:p>
         </w:tc>
@@ -1772,15 +1963,15 @@
         </w:tblBorders>
       </w:tblPr>
       <w:tblGrid>
-        <w:gridCol w:w="3383"/>
-        <w:gridCol w:w="3383"/>
-        <w:gridCol w:w="3383"/>
+        <w:gridCol w:w="1814"/>
+        <w:gridCol w:w="4932"/>
+        <w:gridCol w:w="2948"/>
       </w:tblGrid>
       <w:tr>
         <w:tc>
           <w:tcPr>
             <w:tcW w:type="dxa" w:w="1814"/>
-            <w:shd w:fill="D9E2F3"/>
+            <w:shd w:val="clear" w:color="auto" w:fill="D9E2F3"/>
             <w:tcMar>
               <w:top w:w="55" w:type="dxa"/>
               <w:start w:w="70" w:type="dxa"/>
@@ -1804,7 +1995,7 @@
         <w:tc>
           <w:tcPr>
             <w:tcW w:type="dxa" w:w="4932"/>
-            <w:shd w:fill="D9E2F3"/>
+            <w:shd w:val="clear" w:color="auto" w:fill="D9E2F3"/>
             <w:tcMar>
               <w:top w:w="55" w:type="dxa"/>
               <w:start w:w="70" w:type="dxa"/>
@@ -1828,7 +2019,7 @@
         <w:tc>
           <w:tcPr>
             <w:tcW w:type="dxa" w:w="2948"/>
-            <w:shd w:fill="D9E2F3"/>
+            <w:shd w:val="clear" w:color="auto" w:fill="D9E2F3"/>
             <w:tcMar>
               <w:top w:w="55" w:type="dxa"/>
               <w:start w:w="70" w:type="dxa"/>
@@ -2148,7 +2339,25 @@
           <w:i w:val="0"/>
           <w:sz w:val="18"/>
         </w:rPr>
-        <w:t>Um scan manual do host coletou 175 processos, 21 serviços, 1 socket e 101 registros de permissões. O relatório registrou 97 issues de coleta — principalmente campos de executáveis inacessíveis sem privilégios, visibilidade limitada de sockets e ExecStart não resolvido — e produziu 20 findings informational, 0 needs_review e 6 inconclusive. Esse resultado é coerente com o projeto: limitações são preservadas como evidência ausente, e a ausência de um sinal forte não é convertida artificialmente em alerta.</w:t>
+        <w:t xml:space="preserve">Um scan manual do host, </w:t>
+      </w:r>
+      <w:r>
+        <w:rPr>
+          <w:rFonts w:ascii="Aptos" w:hAnsi="Aptos"/>
+          <w:b w:val="0"/>
+          <w:i w:val="0"/>
+          <w:sz w:val="18"/>
+        </w:rPr>
+        <w:t xml:space="preserve">executado como usuário sem privilégios (sem sudo)</w:t>
+      </w:r>
+      <w:r>
+        <w:rPr>
+          <w:rFonts w:ascii="Aptos" w:hAnsi="Aptos"/>
+          <w:b w:val="0"/>
+          <w:i w:val="0"/>
+          <w:sz w:val="18"/>
+        </w:rPr>
+        <w:t xml:space="preserve">, coletou 175 processos, 21 serviços, 1 socket e 101 registros de permissões. O relatório registrou 97 issues de coleta — principalmente campos de executáveis inacessíveis sem privilégios, visibilidade limitada de sockets e ExecStart não resolvido — e produziu 20 findings informational, 0 needs_review e 6 inconclusive. Esse resultado é coerente com o projeto: limitações são preservadas como evidência ausente, e a ausência de um sinal forte não é convertida artificialmente em alerta.</w:t>
       </w:r>
     </w:p>
     <w:p>
@@ -2218,6 +2427,348 @@
           <w:color w:val="365F91"/>
           <w:sz w:val="21"/>
         </w:rPr>
+        <w:t>Exemplo de finding completo (C1, cenário unsafe_service — resumido)</w:t>
+      </w:r>
+    </w:p>
+    <w:tbl>
+      <w:tblPr>
+        <w:tblW w:type="dxa" w:w="9694"/>
+        <w:jc w:val="center"/>
+        <w:tblBorders>
+          <w:top w:val="single" w:sz="4" w:color="D9E2F3"/>
+          <w:left w:val="single" w:sz="4" w:color="D9E2F3"/>
+          <w:bottom w:val="single" w:sz="4" w:color="D9E2F3"/>
+          <w:right w:val="single" w:sz="4" w:color="D9E2F3"/>
+          <w:insideH w:val="single" w:sz="4" w:color="D9E2F3"/>
+          <w:insideV w:val="single" w:sz="4" w:color="D9E2F3"/>
+        </w:tblBorders>
+        <w:tblLayout w:type="fixed"/>
+        <w:tblLook w:val="04A0" w:firstRow="1" w:lastRow="0" w:firstColumn="1" w:lastColumn="0" w:noHBand="0" w:noVBand="1"/>
+      </w:tblPr>
+      <w:tblGrid>
+        <w:gridCol w:w="1900"/>
+        <w:gridCol w:w="7794"/>
+      </w:tblGrid>
+      <w:tr>
+        <w:tc>
+          <w:tcPr>
+            <w:tcW w:w="1900" w:type="dxa"/>
+            <w:shd w:val="clear" w:color="auto" w:fill="D9E2F3"/>
+            <w:tcMar>
+              <w:top w:w="45" w:type="dxa"/>
+              <w:start w:w="70" w:type="dxa"/>
+              <w:bottom w:w="45" w:type="dxa"/>
+              <w:end w:w="70" w:type="dxa"/>
+            </w:tcMar>
+          </w:tcPr>
+          <w:p>
+            <w:pPr>
+              <w:spacing w:after="0" w:line="240" w:lineRule="auto"/>
+            </w:pPr>
+            <w:r>
+              <w:rPr>
+                <w:rFonts w:ascii="Aptos" w:hAnsi="Aptos"/>
+                <w:b/>
+                <w:i w:val="0"/>
+                <w:color w:val="17365D"/>
+                <w:sz w:val="16"/>
+              </w:rPr>
+              <w:t xml:space="preserve">Campo</w:t>
+            </w:r>
+          </w:p>
+        </w:tc>
+        <w:tc>
+          <w:tcPr>
+            <w:tcW w:w="7794" w:type="dxa"/>
+            <w:shd w:val="clear" w:color="auto" w:fill="D9E2F3"/>
+            <w:tcMar>
+              <w:top w:w="45" w:type="dxa"/>
+              <w:start w:w="70" w:type="dxa"/>
+              <w:bottom w:w="45" w:type="dxa"/>
+              <w:end w:w="70" w:type="dxa"/>
+            </w:tcMar>
+          </w:tcPr>
+          <w:p>
+            <w:pPr>
+              <w:spacing w:after="0" w:line="240" w:lineRule="auto"/>
+            </w:pPr>
+            <w:r>
+              <w:rPr>
+                <w:rFonts w:ascii="Aptos" w:hAnsi="Aptos"/>
+                <w:b/>
+                <w:i w:val="0"/>
+                <w:color w:val="17365D"/>
+                <w:sz w:val="16"/>
+              </w:rPr>
+              <w:t xml:space="preserve">Conteúdo</w:t>
+            </w:r>
+          </w:p>
+        </w:tc>
+      </w:tr>
+      <w:tr>
+        <w:tc>
+          <w:tcPr>
+            <w:tcW w:w="1900" w:type="dxa"/>
+            <w:tcMar>
+              <w:top w:w="45" w:type="dxa"/>
+              <w:start w:w="70" w:type="dxa"/>
+              <w:bottom w:w="45" w:type="dxa"/>
+              <w:end w:w="70" w:type="dxa"/>
+            </w:tcMar>
+          </w:tcPr>
+          <w:p>
+            <w:pPr>
+              <w:spacing w:after="0" w:line="240" w:lineRule="auto"/>
+            </w:pPr>
+            <w:r>
+              <w:rPr>
+                <w:rFonts w:ascii="Aptos" w:hAnsi="Aptos"/>
+                <w:b/>
+                <w:i w:val="0"/>
+                <w:sz w:val="16"/>
+              </w:rPr>
+              <w:t xml:space="preserve">Evidência</w:t>
+            </w:r>
+          </w:p>
+        </w:tc>
+        <w:tc>
+          <w:tcPr>
+            <w:tcW w:w="7794" w:type="dxa"/>
+            <w:tcMar>
+              <w:top w:w="45" w:type="dxa"/>
+              <w:start w:w="70" w:type="dxa"/>
+              <w:bottom w:w="45" w:type="dxa"/>
+              <w:end w:w="70" w:type="dxa"/>
+            </w:tcMar>
+          </w:tcPr>
+          <w:p>
+            <w:pPr>
+              <w:spacing w:after="0" w:line="240" w:lineRule="auto"/>
+            </w:pPr>
+            <w:r>
+              <w:rPr>
+                <w:rFonts w:ascii="Aptos" w:hAnsi="Aptos"/>
+                <w:b w:val="0"/>
+                <w:i w:val="0"/>
+                <w:sz w:val="16"/>
+              </w:rPr>
+              <w:t xml:space="preserve">Serviço ativo; MainPID 42; UID efetivo 0; recurso /opt/demo/worker com modo 0777.</w:t>
+            </w:r>
+          </w:p>
+        </w:tc>
+      </w:tr>
+      <w:tr>
+        <w:tc>
+          <w:tcPr>
+            <w:tcW w:w="1900" w:type="dxa"/>
+            <w:tcMar>
+              <w:top w:w="45" w:type="dxa"/>
+              <w:start w:w="70" w:type="dxa"/>
+              <w:bottom w:w="45" w:type="dxa"/>
+              <w:end w:w="70" w:type="dxa"/>
+            </w:tcMar>
+          </w:tcPr>
+          <w:p>
+            <w:pPr>
+              <w:spacing w:after="0" w:line="240" w:lineRule="auto"/>
+            </w:pPr>
+            <w:r>
+              <w:rPr>
+                <w:rFonts w:ascii="Aptos" w:hAnsi="Aptos"/>
+                <w:b/>
+                <w:i w:val="0"/>
+                <w:sz w:val="16"/>
+              </w:rPr>
+              <w:t xml:space="preserve">Interpretação</w:t>
+            </w:r>
+          </w:p>
+        </w:tc>
+        <w:tc>
+          <w:tcPr>
+            <w:tcW w:w="7794" w:type="dxa"/>
+            <w:tcMar>
+              <w:top w:w="45" w:type="dxa"/>
+              <w:start w:w="70" w:type="dxa"/>
+              <w:bottom w:w="45" w:type="dxa"/>
+              <w:end w:w="70" w:type="dxa"/>
+            </w:tcMar>
+          </w:tcPr>
+          <w:p>
+            <w:r>
+              <w:rPr/>
+              <w:t>Pelos bits POSIX observados, o recurso possui escrita para “outros”, indicando possibilidade de modificação por identidade não-root.</w:t>
+            </w:r>
+          </w:p>
+        </w:tc>
+      </w:tr>
+      <w:tr>
+        <w:tc>
+          <w:tcPr>
+            <w:tcW w:w="1900" w:type="dxa"/>
+            <w:tcMar>
+              <w:top w:w="45" w:type="dxa"/>
+              <w:start w:w="70" w:type="dxa"/>
+              <w:bottom w:w="45" w:type="dxa"/>
+              <w:end w:w="70" w:type="dxa"/>
+            </w:tcMar>
+          </w:tcPr>
+          <w:p>
+            <w:pPr>
+              <w:spacing w:after="0" w:line="240" w:lineRule="auto"/>
+            </w:pPr>
+            <w:r>
+              <w:rPr>
+                <w:rFonts w:ascii="Aptos" w:hAnsi="Aptos"/>
+                <w:b/>
+                <w:i w:val="0"/>
+                <w:sz w:val="16"/>
+              </w:rPr>
+              <w:t xml:space="preserve">Hipótese</w:t>
+            </w:r>
+          </w:p>
+        </w:tc>
+        <w:tc>
+          <w:tcPr>
+            <w:tcW w:w="7794" w:type="dxa"/>
+            <w:tcMar>
+              <w:top w:w="45" w:type="dxa"/>
+              <w:start w:w="70" w:type="dxa"/>
+              <w:bottom w:w="45" w:type="dxa"/>
+              <w:end w:w="70" w:type="dxa"/>
+            </w:tcMar>
+          </w:tcPr>
+          <w:p>
+            <w:pPr>
+              <w:spacing w:after="0" w:line="240" w:lineRule="auto"/>
+            </w:pPr>
+            <w:r>
+              <w:rPr>
+                <w:rFonts w:ascii="Aptos" w:hAnsi="Aptos"/>
+                <w:b w:val="0"/>
+                <w:i w:val="0"/>
+                <w:sz w:val="16"/>
+              </w:rPr>
+              <w:t xml:space="preserve">Possível relação de privilégio insegura (configuração inadequada). Não indica que o arquivo foi alterado nem que houve exploração.</w:t>
+            </w:r>
+          </w:p>
+        </w:tc>
+      </w:tr>
+      <w:tr>
+        <w:tc>
+          <w:tcPr>
+            <w:tcW w:w="1900" w:type="dxa"/>
+            <w:tcMar>
+              <w:top w:w="45" w:type="dxa"/>
+              <w:start w:w="70" w:type="dxa"/>
+              <w:bottom w:w="45" w:type="dxa"/>
+              <w:end w:w="70" w:type="dxa"/>
+            </w:tcMar>
+          </w:tcPr>
+          <w:p>
+            <w:pPr>
+              <w:spacing w:after="0" w:line="240" w:lineRule="auto"/>
+            </w:pPr>
+            <w:r>
+              <w:rPr>
+                <w:rFonts w:ascii="Aptos" w:hAnsi="Aptos"/>
+                <w:b/>
+                <w:i w:val="0"/>
+                <w:sz w:val="16"/>
+              </w:rPr>
+              <w:t xml:space="preserve">Evidência ausente</w:t>
+            </w:r>
+          </w:p>
+        </w:tc>
+        <w:tc>
+          <w:tcPr>
+            <w:tcW w:w="7794" w:type="dxa"/>
+            <w:tcMar>
+              <w:top w:w="45" w:type="dxa"/>
+              <w:start w:w="70" w:type="dxa"/>
+              <w:bottom w:w="45" w:type="dxa"/>
+              <w:end w:w="70" w:type="dxa"/>
+            </w:tcMar>
+          </w:tcPr>
+          <w:p>
+            <w:pPr>
+              <w:spacing w:after="0" w:line="240" w:lineRule="auto"/>
+            </w:pPr>
+            <w:r>
+              <w:rPr>
+                <w:rFonts w:ascii="Aptos" w:hAnsi="Aptos"/>
+                <w:b w:val="0"/>
+                <w:i w:val="0"/>
+                <w:sz w:val="16"/>
+              </w:rPr>
+              <w:t xml:space="preserve">Integridade/histórico do arquivo (hash de referência), ACLs, flags de mount (ro/noexec), atributos imutáveis e logs que liguem alguma alteração a um usuário.</w:t>
+            </w:r>
+          </w:p>
+        </w:tc>
+      </w:tr>
+      <w:tr>
+        <w:tc>
+          <w:tcPr>
+            <w:tcW w:w="1900" w:type="dxa"/>
+            <w:tcMar>
+              <w:top w:w="45" w:type="dxa"/>
+              <w:start w:w="70" w:type="dxa"/>
+              <w:bottom w:w="45" w:type="dxa"/>
+              <w:end w:w="70" w:type="dxa"/>
+            </w:tcMar>
+          </w:tcPr>
+          <w:p>
+            <w:pPr>
+              <w:spacing w:after="0" w:line="240" w:lineRule="auto"/>
+            </w:pPr>
+            <w:r>
+              <w:rPr>
+                <w:rFonts w:ascii="Aptos" w:hAnsi="Aptos"/>
+                <w:b/>
+                <w:i w:val="0"/>
+                <w:sz w:val="16"/>
+              </w:rPr>
+              <w:t xml:space="preserve">Resultado</w:t>
+            </w:r>
+          </w:p>
+        </w:tc>
+        <w:tc>
+          <w:tcPr>
+            <w:tcW w:w="7794" w:type="dxa"/>
+            <w:tcMar>
+              <w:top w:w="45" w:type="dxa"/>
+              <w:start w:w="70" w:type="dxa"/>
+              <w:bottom w:w="45" w:type="dxa"/>
+              <w:end w:w="70" w:type="dxa"/>
+            </w:tcMar>
+          </w:tcPr>
+          <w:p>
+            <w:pPr>
+              <w:spacing w:after="0" w:line="240" w:lineRule="auto"/>
+            </w:pPr>
+            <w:r>
+              <w:rPr>
+                <w:rFonts w:ascii="Aptos" w:hAnsi="Aptos"/>
+                <w:b w:val="0"/>
+                <w:i w:val="0"/>
+                <w:sz w:val="16"/>
+              </w:rPr>
+              <w:t xml:space="preserve">needs_review</w:t>
+            </w:r>
+          </w:p>
+        </w:tc>
+      </w:tr>
+    </w:tbl>
+    <w:p>
+      <w:pPr>
+        <w:spacing w:before="40" w:after="40"/>
+      </w:pPr>
+      <w:r>
+        <w:rPr>
+          <w:rFonts w:ascii="Aptos" w:hAnsi="Aptos"/>
+          <w:b/>
+          <w:color w:val="365F91"/>
+          <w:sz w:val="21"/>
+        </w:rPr>
         <w:t>Reprodutibilidade</w:t>
       </w:r>
     </w:p>
@@ -2237,6 +2788,7 @@
     </w:p>
     <w:p>
       <w:r>
+        <w:rPr/>
         <w:br w:type="page"/>
       </w:r>
     </w:p>
@@ -2340,6 +2892,81 @@
     </w:p>
     <w:p>
       <w:pPr>
+        <w:pStyle w:val="ListBullet"/>
+        <w:spacing w:after="36" w:line="240" w:lineRule="auto"/>
+        <w:ind w:left="198" w:hanging="85"/>
+      </w:pPr>
+      <w:r>
+        <w:rPr>
+          <w:rFonts w:ascii="Aptos" w:hAnsi="Aptos"/>
+          <w:b/>
+          <w:i w:val="0"/>
+          <w:sz w:val="17"/>
+        </w:rPr>
+        <w:t xml:space="preserve">Falsos positivos possíveis: </w:t>
+      </w:r>
+      <w:r>
+        <w:rPr>
+          <w:rFonts w:ascii="Aptos" w:hAnsi="Aptos"/>
+          <w:b w:val="0"/>
+          <w:i w:val="0"/>
+          <w:sz w:val="17"/>
+        </w:rPr>
+        <w:t xml:space="preserve">needs_review para arquivo 0777 cujo acesso real é bloqueado por diretório ancestral restritivo, mount somente leitura ou atributo imutável; associação de socket/processo ao serviço errado em C2 se um PID for reutilizado durante a coleta.</w:t>
+      </w:r>
+    </w:p>
+    <w:p>
+      <w:pPr>
+        <w:pStyle w:val="ListBullet"/>
+        <w:spacing w:after="36" w:line="240" w:lineRule="auto"/>
+        <w:ind w:left="198" w:hanging="85"/>
+      </w:pPr>
+      <w:r>
+        <w:rPr>
+          <w:rFonts w:ascii="Aptos" w:hAnsi="Aptos"/>
+          <w:b/>
+          <w:i w:val="0"/>
+          <w:sz w:val="17"/>
+        </w:rPr>
+        <w:t xml:space="preserve">Falsos negativos possíveis: </w:t>
+      </w:r>
+      <w:r>
+        <w:rPr>
+          <w:rFonts w:ascii="Aptos" w:hAnsi="Aptos"/>
+          <w:b w:val="0"/>
+          <w:i w:val="0"/>
+          <w:sz w:val="17"/>
+        </w:rPr>
+        <w:t xml:space="preserve">escrita concedida por ACL, grupo suplementar, capability ou diretório acima do pai imediato não gera needs_review; recursos citados só em ExecStart ambíguo não são avaliados.</w:t>
+      </w:r>
+    </w:p>
+    <w:p>
+      <w:pPr>
+        <w:pStyle w:val="ListBullet"/>
+        <w:spacing w:after="36" w:line="240" w:lineRule="auto"/>
+        <w:ind w:left="198" w:hanging="85"/>
+      </w:pPr>
+      <w:r>
+        <w:rPr>
+          <w:rFonts w:ascii="Aptos" w:hAnsi="Aptos"/>
+          <w:b/>
+          <w:i w:val="0"/>
+          <w:sz w:val="17"/>
+        </w:rPr>
+        <w:t xml:space="preserve">Sem logs: </w:t>
+      </w:r>
+      <w:r>
+        <w:rPr>
+          <w:rFonts w:ascii="Aptos" w:hAnsi="Aptos"/>
+          <w:b w:val="0"/>
+          <w:i w:val="0"/>
+          <w:sz w:val="17"/>
+        </w:rPr>
+        <w:t xml:space="preserve">journald/syslog não são coletados, portanto não há reconstrução temporal (“processo + serviço + log”) nem como saber se uma configuração insegura já foi explorada.</w:t>
+      </w:r>
+    </w:p>
+    <w:p>
+      <w:pPr>
         <w:spacing w:before="40" w:after="40"/>
       </w:pPr>
       <w:r>
@@ -2357,13 +2984,8 @@
         <w:spacing w:after="80" w:line="252" w:lineRule="auto"/>
       </w:pPr>
       <w:r>
-        <w:rPr>
-          <w:rFonts w:ascii="Aptos" w:hAnsi="Aptos"/>
-          <w:b w:val="0"/>
-          <w:i w:val="0"/>
-          <w:sz w:val="18"/>
-        </w:rPr>
-        <w:t>IA foi utilizada como assistência ao desenvolvimento, revisão e documentação. A ferramenta, porém, não depende de LLM em execução: coleta, normalização, permissões e correlações são mecanismos determinísticos próprios. Essa escolha mantém evidências estruturadas antes de qualquer interpretação e evita que uma resposta probabilística seja a única camada de análise.</w:t>
+        <w:rPr/>
+        <w:t>IA generativa (ChatGPT, Codex e Claude) foi usada como apoio à programação, à escrita de testes, à revisão de código e à documentação. O código sugerido foi revisado durante o desenvolvimento e só incorporado após passar pela suíte de testes. A ferramenta não depende de LLM em execução: coleta, normalização, análise de permissões e correlações são mecanismos determinísticos próprios, e os textos de interpretação e hipótese de cada finding são gerados por regras, não por um modelo. Isso atende à exigência de produzir evidências estruturadas antes de qualquer interpretação e evita que uma resposta probabilística seja a única camada de análise.</w:t>
       </w:r>
     </w:p>
     <w:p>
@@ -2377,7 +2999,7 @@
           <w:color w:val="365F91"/>
           <w:sz w:val="21"/>
         </w:rPr>
-        <w:t>Cobertura da avaliação</w:t>
+        <w:t>Rastreabilidade dos requisitos</w:t>
       </w:r>
     </w:p>
     <w:tbl>
@@ -2396,14 +3018,14 @@
         </w:tblBorders>
       </w:tblPr>
       <w:tblGrid>
-        <w:gridCol w:w="5074"/>
-        <w:gridCol w:w="5074"/>
+        <w:gridCol w:w="3401"/>
+        <w:gridCol w:w="6349"/>
       </w:tblGrid>
       <w:tr>
         <w:tc>
           <w:tcPr>
             <w:tcW w:type="dxa" w:w="3401"/>
-            <w:shd w:fill="D9E2F3"/>
+            <w:shd w:val="clear" w:color="auto" w:fill="D9E2F3"/>
             <w:tcMar>
               <w:top w:w="55" w:type="dxa"/>
               <w:start w:w="70" w:type="dxa"/>
@@ -2420,14 +3042,14 @@
                 <w:color w:val="17365D"/>
                 <w:sz w:val="16"/>
               </w:rPr>
-              <w:t>Critério</w:t>
+              <w:t>Requisito do enunciado</w:t>
             </w:r>
           </w:p>
         </w:tc>
         <w:tc>
           <w:tcPr>
             <w:tcW w:type="dxa" w:w="6349"/>
-            <w:shd w:fill="D9E2F3"/>
+            <w:shd w:val="clear" w:color="auto" w:fill="D9E2F3"/>
             <w:tcMar>
               <w:top w:w="55" w:type="dxa"/>
               <w:start w:w="70" w:type="dxa"/>
@@ -2468,7 +3090,7 @@
                 <w:i w:val="0"/>
                 <w:sz w:val="15"/>
               </w:rPr>
-              <w:t>Funcionamento (3,0)</w:t>
+              <w:t>Funcionamento da solução</w:t>
             </w:r>
           </w:p>
         </w:tc>
@@ -2514,7 +3136,7 @@
                 <w:i w:val="0"/>
                 <w:sz w:val="15"/>
               </w:rPr>
-              <w:t>Processos, permissões e serviços (2,0)</w:t>
+              <w:t>Processos, permissões e serviços</w:t>
             </w:r>
           </w:p>
         </w:tc>
@@ -2560,7 +3182,7 @@
                 <w:i w:val="0"/>
                 <w:sz w:val="15"/>
               </w:rPr>
-              <w:t>Correlação (2,0)</w:t>
+              <w:t>Correlação entre evidências</w:t>
             </w:r>
           </w:p>
         </w:tc>
@@ -2606,7 +3228,7 @@
                 <w:i w:val="0"/>
                 <w:sz w:val="15"/>
               </w:rPr>
-              <w:t>Qualidade da análise (1,5)</w:t>
+              <w:t>Evidência × interpretação × hipótese</w:t>
             </w:r>
           </w:p>
         </w:tc>
@@ -2652,7 +3274,7 @@
                 <w:i w:val="0"/>
                 <w:sz w:val="15"/>
               </w:rPr>
-              <w:t>Arquitetura/documentação (1,0)</w:t>
+              <w:t>Arquitetura, código e documentação</w:t>
             </w:r>
           </w:p>
         </w:tc>
@@ -2698,7 +3320,7 @@
                 <w:i w:val="0"/>
                 <w:sz w:val="15"/>
               </w:rPr>
-              <w:t>Demonstração/domínio (0,5)</w:t>
+              <w:t>Demonstração</w:t>
             </w:r>
           </w:p>
         </w:tc>
@@ -2775,7 +3397,7 @@
         <w:tc>
           <w:tcPr>
             <w:tcW w:type="dxa" w:w="10148"/>
-            <w:shd w:fill="F4F7FB"/>
+            <w:shd w:val="clear" w:color="auto" w:fill="F4F7FB"/>
             <w:tcMar>
               <w:top w:w="85" w:type="dxa"/>
               <w:start w:w="100" w:type="dxa"/>

</xml_diff>